<commit_message>
Corrige templates ADR/INT para refletir a estrutura completa dos documentos reais
</commit_message>
<xml_diff>
--- a/planner-api/templates/adr_template.docx
+++ b/planner-api/templates/adr_template.docx
@@ -36,6 +36,7 @@
           <w:p>
             <w:r>
               <w:rPr>
+                <w:b/>
                 <w:sz w:val="20"/>
               </w:rPr>
               <w:t>Identificador</w:t>
@@ -49,6 +50,7 @@
           <w:p>
             <w:r>
               <w:rPr>
+                <w:b w:val="0"/>
                 <w:sz w:val="20"/>
               </w:rPr>
               <w:t>{{ codigo }}</w:t>
@@ -64,6 +66,7 @@
           <w:p>
             <w:r>
               <w:rPr>
+                <w:b/>
                 <w:sz w:val="20"/>
               </w:rPr>
               <w:t>Título</w:t>
@@ -77,6 +80,7 @@
           <w:p>
             <w:r>
               <w:rPr>
+                <w:b w:val="0"/>
                 <w:sz w:val="20"/>
               </w:rPr>
               <w:t>{{ titulo }}</w:t>
@@ -92,6 +96,7 @@
           <w:p>
             <w:r>
               <w:rPr>
+                <w:b/>
                 <w:sz w:val="20"/>
               </w:rPr>
               <w:t>Status</w:t>
@@ -105,6 +110,7 @@
           <w:p>
             <w:r>
               <w:rPr>
+                <w:b w:val="0"/>
                 <w:sz w:val="20"/>
               </w:rPr>
               <w:t>{{ status }}</w:t>
@@ -120,6 +126,7 @@
           <w:p>
             <w:r>
               <w:rPr>
+                <w:b/>
                 <w:sz w:val="20"/>
               </w:rPr>
               <w:t>Data</w:t>
@@ -133,6 +140,7 @@
           <w:p>
             <w:r>
               <w:rPr>
+                <w:b w:val="0"/>
                 <w:sz w:val="20"/>
               </w:rPr>
               <w:t>{{ data }}</w:t>
@@ -148,6 +156,7 @@
           <w:p>
             <w:r>
               <w:rPr>
+                <w:b/>
                 <w:sz w:val="20"/>
               </w:rPr>
               <w:t>Domínio</w:t>
@@ -161,6 +170,7 @@
           <w:p>
             <w:r>
               <w:rPr>
+                <w:b w:val="0"/>
                 <w:sz w:val="20"/>
               </w:rPr>
               <w:t>{{ dominio }}</w:t>
@@ -176,6 +186,7 @@
           <w:p>
             <w:r>
               <w:rPr>
+                <w:b/>
                 <w:sz w:val="20"/>
               </w:rPr>
               <w:t>Autores</w:t>
@@ -189,6 +200,7 @@
           <w:p>
             <w:r>
               <w:rPr>
+                <w:b w:val="0"/>
                 <w:sz w:val="20"/>
               </w:rPr>
               <w:t>{{ autores }}</w:t>
@@ -204,6 +216,7 @@
           <w:p>
             <w:r>
               <w:rPr>
+                <w:b/>
                 <w:sz w:val="20"/>
               </w:rPr>
               <w:t>Aprovadores</w:t>
@@ -217,6 +230,7 @@
           <w:p>
             <w:r>
               <w:rPr>
+                <w:b w:val="0"/>
                 <w:sz w:val="20"/>
               </w:rPr>
               <w:t>{{ aprovadores }}</w:t>
@@ -240,6 +254,57 @@
       </w:r>
     </w:p>
     <w:p>
+      <w:r>
+        <w:t>{% for bloco in subsecoes_contexto %}</w:t>
+      </w:r>
+    </w:p>
+    <w:p>
+      <w:pPr>
+        <w:pStyle w:val="Heading2"/>
+      </w:pPr>
+      <w:r>
+        <w:t>{{ bloco.titulo }}</w:t>
+      </w:r>
+    </w:p>
+    <w:p>
+      <w:r>
+        <w:t>{% for paragrafo in bloco.paragrafos %}</w:t>
+      </w:r>
+    </w:p>
+    <w:p>
+      <w:r>
+        <w:t>{{ paragrafo }}</w:t>
+      </w:r>
+    </w:p>
+    <w:p>
+      <w:r>
+        <w:t>{% endfor %}</w:t>
+      </w:r>
+    </w:p>
+    <w:p>
+      <w:r>
+        <w:t>{% for item in bloco.bullets %}</w:t>
+      </w:r>
+    </w:p>
+    <w:p>
+      <w:pPr>
+        <w:pStyle w:val="ListBullet"/>
+      </w:pPr>
+      <w:r>
+        <w:t>{{ item }}</w:t>
+      </w:r>
+    </w:p>
+    <w:p>
+      <w:r>
+        <w:t>{% endfor %}</w:t>
+      </w:r>
+    </w:p>
+    <w:p>
+      <w:r>
+        <w:t>{% endfor %}</w:t>
+      </w:r>
+    </w:p>
+    <w:p>
       <w:pPr>
         <w:pStyle w:val="Heading1"/>
       </w:pPr>
@@ -253,11 +318,90 @@
       </w:r>
     </w:p>
     <w:p>
+      <w:r>
+        <w:t>{% for bloco in subsecoes_decisao %}</w:t>
+      </w:r>
+    </w:p>
+    <w:p>
+      <w:pPr>
+        <w:pStyle w:val="Heading2"/>
+      </w:pPr>
+      <w:r>
+        <w:t>{{ bloco.titulo }}</w:t>
+      </w:r>
+    </w:p>
+    <w:p>
+      <w:r>
+        <w:t>{% for paragrafo in bloco.paragrafos %}</w:t>
+      </w:r>
+    </w:p>
+    <w:p>
+      <w:r>
+        <w:t>{{ paragrafo }}</w:t>
+      </w:r>
+    </w:p>
+    <w:p>
+      <w:r>
+        <w:t>{% endfor %}</w:t>
+      </w:r>
+    </w:p>
+    <w:p>
+      <w:r>
+        <w:t>{% for item in bloco.bullets %}</w:t>
+      </w:r>
+    </w:p>
+    <w:p>
+      <w:pPr>
+        <w:pStyle w:val="ListBullet"/>
+      </w:pPr>
+      <w:r>
+        <w:t>{{ item }}</w:t>
+      </w:r>
+    </w:p>
+    <w:p>
+      <w:r>
+        <w:t>{% endfor %}</w:t>
+      </w:r>
+    </w:p>
+    <w:p>
+      <w:r>
+        <w:t>{% endfor %}</w:t>
+      </w:r>
+    </w:p>
+    <w:p>
       <w:pPr>
         <w:pStyle w:val="Heading1"/>
       </w:pPr>
       <w:r>
         <w:t>3. Alternativas Consideradas</w:t>
+      </w:r>
+    </w:p>
+    <w:p>
+      <w:r>
+        <w:t>{% for alt in alternativas %}</w:t>
+      </w:r>
+    </w:p>
+    <w:p>
+      <w:pPr>
+        <w:pStyle w:val="Heading2"/>
+      </w:pPr>
+      <w:r>
+        <w:t>{{ alt.nome }}</w:t>
+      </w:r>
+    </w:p>
+    <w:p>
+      <w:r>
+        <w:t>{{ alt.descricao }}</w:t>
+      </w:r>
+    </w:p>
+    <w:p>
+      <w:r>
+        <w:t>{% endfor %}</w:t>
+      </w:r>
+    </w:p>
+    <w:p>
+      <w:r>
+        <w:t>{% if tabela_comparativa %}</w:t>
       </w:r>
     </w:p>
     <w:tbl>
@@ -267,30 +411,227 @@
         <w:tblLook w:firstColumn="1" w:firstRow="1" w:lastColumn="0" w:lastRow="0" w:noHBand="0" w:noVBand="1" w:val="04A0"/>
       </w:tblPr>
       <w:tblGrid>
-        <w:gridCol w:w="4320"/>
-        <w:gridCol w:w="4320"/>
+        <w:gridCol w:w="2880"/>
+        <w:gridCol w:w="2880"/>
+        <w:gridCol w:w="2880"/>
       </w:tblGrid>
       <w:tr>
         <w:tc>
           <w:tcPr>
-            <w:tcW w:type="dxa" w:w="4320"/>
+            <w:tcW w:type="dxa" w:w="2880"/>
           </w:tcPr>
           <w:p>
             <w:r>
               <w:rPr>
+                <w:b/>
                 <w:sz w:val="20"/>
               </w:rPr>
-              <w:t>Alternativa</w:t>
+              <w:t>Critério</w:t>
             </w:r>
           </w:p>
         </w:tc>
         <w:tc>
           <w:tcPr>
-            <w:tcW w:type="dxa" w:w="4320"/>
+            <w:tcW w:type="dxa" w:w="2880"/>
           </w:tcPr>
           <w:p>
             <w:r>
               <w:rPr>
+                <w:b/>
+                <w:sz w:val="20"/>
+              </w:rPr>
+              <w:t>{{ opcao_a_nome }}</w:t>
+            </w:r>
+          </w:p>
+        </w:tc>
+        <w:tc>
+          <w:tcPr>
+            <w:tcW w:type="dxa" w:w="2880"/>
+          </w:tcPr>
+          <w:p>
+            <w:r>
+              <w:rPr>
+                <w:b/>
+                <w:sz w:val="20"/>
+              </w:rPr>
+              <w:t>{{ opcao_b_nome }}</w:t>
+            </w:r>
+          </w:p>
+        </w:tc>
+      </w:tr>
+      <w:tr>
+        <w:tc>
+          <w:tcPr>
+            <w:tcW w:type="dxa" w:w="2880"/>
+          </w:tcPr>
+          <w:p>
+            <w:r>
+              <w:rPr>
+                <w:b w:val="0"/>
+                <w:sz w:val="20"/>
+              </w:rPr>
+              <w:t>{%tr for linha in tabela_comparativa %}</w:t>
+            </w:r>
+          </w:p>
+        </w:tc>
+        <w:tc>
+          <w:tcPr>
+            <w:tcW w:type="dxa" w:w="2880"/>
+          </w:tcPr>
+          <w:p/>
+        </w:tc>
+        <w:tc>
+          <w:tcPr>
+            <w:tcW w:type="dxa" w:w="2880"/>
+          </w:tcPr>
+          <w:p/>
+        </w:tc>
+      </w:tr>
+      <w:tr>
+        <w:tc>
+          <w:tcPr>
+            <w:tcW w:type="dxa" w:w="2880"/>
+          </w:tcPr>
+          <w:p>
+            <w:r>
+              <w:rPr>
+                <w:b w:val="0"/>
+                <w:sz w:val="20"/>
+              </w:rPr>
+              <w:t>{{ linha.criterio }}</w:t>
+            </w:r>
+          </w:p>
+        </w:tc>
+        <w:tc>
+          <w:tcPr>
+            <w:tcW w:type="dxa" w:w="2880"/>
+          </w:tcPr>
+          <w:p>
+            <w:r>
+              <w:rPr>
+                <w:b w:val="0"/>
+                <w:sz w:val="20"/>
+              </w:rPr>
+              <w:t>{{ linha.opcao_a }}</w:t>
+            </w:r>
+          </w:p>
+        </w:tc>
+        <w:tc>
+          <w:tcPr>
+            <w:tcW w:type="dxa" w:w="2880"/>
+          </w:tcPr>
+          <w:p>
+            <w:r>
+              <w:rPr>
+                <w:b w:val="0"/>
+                <w:sz w:val="20"/>
+              </w:rPr>
+              <w:t>{{ linha.opcao_b }}</w:t>
+            </w:r>
+          </w:p>
+        </w:tc>
+      </w:tr>
+      <w:tr>
+        <w:tc>
+          <w:tcPr>
+            <w:tcW w:type="dxa" w:w="2880"/>
+          </w:tcPr>
+          <w:p>
+            <w:r>
+              <w:rPr>
+                <w:b w:val="0"/>
+                <w:sz w:val="20"/>
+              </w:rPr>
+              <w:t>{%tr endfor %}</w:t>
+            </w:r>
+          </w:p>
+        </w:tc>
+        <w:tc>
+          <w:tcPr>
+            <w:tcW w:type="dxa" w:w="2880"/>
+          </w:tcPr>
+          <w:p/>
+        </w:tc>
+        <w:tc>
+          <w:tcPr>
+            <w:tcW w:type="dxa" w:w="2880"/>
+          </w:tcPr>
+          <w:p/>
+        </w:tc>
+      </w:tr>
+    </w:tbl>
+    <w:p/>
+    <w:p>
+      <w:r>
+        <w:t>{% endif %}</w:t>
+      </w:r>
+    </w:p>
+    <w:p>
+      <w:r>
+        <w:t>{% if fluxo_integracao %}</w:t>
+      </w:r>
+    </w:p>
+    <w:p>
+      <w:pPr>
+        <w:pStyle w:val="Heading1"/>
+      </w:pPr>
+      <w:r>
+        <w:t>4. Fluxo de Integração — {{ fluxo_integracao.nome }}</w:t>
+      </w:r>
+    </w:p>
+    <w:p>
+      <w:r>
+        <w:t>{{ fluxo_integracao.intro }}</w:t>
+      </w:r>
+    </w:p>
+    <w:tbl>
+      <w:tblPr>
+        <w:tblStyle w:val="TableGrid"/>
+        <w:tblW w:type="auto" w:w="0"/>
+        <w:tblLook w:firstColumn="1" w:firstRow="1" w:lastColumn="0" w:lastRow="0" w:noHBand="0" w:noVBand="1" w:val="04A0"/>
+      </w:tblPr>
+      <w:tblGrid>
+        <w:gridCol w:w="2880"/>
+        <w:gridCol w:w="2880"/>
+        <w:gridCol w:w="2880"/>
+      </w:tblGrid>
+      <w:tr>
+        <w:tc>
+          <w:tcPr>
+            <w:tcW w:type="dxa" w:w="2880"/>
+          </w:tcPr>
+          <w:p>
+            <w:r>
+              <w:rPr>
+                <w:b/>
+                <w:sz w:val="20"/>
+              </w:rPr>
+              <w:t>Passo</w:t>
+            </w:r>
+          </w:p>
+        </w:tc>
+        <w:tc>
+          <w:tcPr>
+            <w:tcW w:type="dxa" w:w="2880"/>
+          </w:tcPr>
+          <w:p>
+            <w:r>
+              <w:rPr>
+                <w:b/>
+                <w:sz w:val="20"/>
+              </w:rPr>
+              <w:t>Ação</w:t>
+            </w:r>
+          </w:p>
+        </w:tc>
+        <w:tc>
+          <w:tcPr>
+            <w:tcW w:type="dxa" w:w="2880"/>
+          </w:tcPr>
+          <w:p>
+            <w:r>
+              <w:rPr>
+                <w:b/>
                 <w:sz w:val="20"/>
               </w:rPr>
               <w:t>Descrição</w:t>
@@ -301,20 +642,27 @@
       <w:tr>
         <w:tc>
           <w:tcPr>
-            <w:tcW w:type="dxa" w:w="4320"/>
+            <w:tcW w:type="dxa" w:w="2880"/>
           </w:tcPr>
           <w:p>
             <w:r>
               <w:rPr>
+                <w:b w:val="0"/>
                 <w:sz w:val="20"/>
               </w:rPr>
-              <w:t>{%tr for alt in alternativas %}</w:t>
+              <w:t>{%tr for passo in fluxo_integracao.passos %}</w:t>
             </w:r>
           </w:p>
         </w:tc>
         <w:tc>
           <w:tcPr>
-            <w:tcW w:type="dxa" w:w="4320"/>
+            <w:tcW w:type="dxa" w:w="2880"/>
+          </w:tcPr>
+          <w:p/>
+        </w:tc>
+        <w:tc>
+          <w:tcPr>
+            <w:tcW w:type="dxa" w:w="2880"/>
           </w:tcPr>
           <w:p/>
         </w:tc>
@@ -322,27 +670,43 @@
       <w:tr>
         <w:tc>
           <w:tcPr>
-            <w:tcW w:type="dxa" w:w="4320"/>
+            <w:tcW w:type="dxa" w:w="2880"/>
           </w:tcPr>
           <w:p>
             <w:r>
               <w:rPr>
+                <w:b w:val="0"/>
                 <w:sz w:val="20"/>
               </w:rPr>
-              <w:t>{{ alt.nome }}</w:t>
+              <w:t>{{ passo.passo }}</w:t>
             </w:r>
           </w:p>
         </w:tc>
         <w:tc>
           <w:tcPr>
-            <w:tcW w:type="dxa" w:w="4320"/>
+            <w:tcW w:type="dxa" w:w="2880"/>
           </w:tcPr>
           <w:p>
             <w:r>
               <w:rPr>
+                <w:b w:val="0"/>
                 <w:sz w:val="20"/>
               </w:rPr>
-              <w:t>{{ alt.descricao }}</w:t>
+              <w:t>{{ passo.acao }}</w:t>
+            </w:r>
+          </w:p>
+        </w:tc>
+        <w:tc>
+          <w:tcPr>
+            <w:tcW w:type="dxa" w:w="2880"/>
+          </w:tcPr>
+          <w:p>
+            <w:r>
+              <w:rPr>
+                <w:b w:val="0"/>
+                <w:sz w:val="20"/>
+              </w:rPr>
+              <w:t>{{ passo.descricao }}</w:t>
             </w:r>
           </w:p>
         </w:tc>
@@ -350,11 +714,12 @@
       <w:tr>
         <w:tc>
           <w:tcPr>
-            <w:tcW w:type="dxa" w:w="4320"/>
+            <w:tcW w:type="dxa" w:w="2880"/>
           </w:tcPr>
           <w:p>
             <w:r>
               <w:rPr>
+                <w:b w:val="0"/>
                 <w:sz w:val="20"/>
               </w:rPr>
               <w:t>{%tr endfor %}</w:t>
@@ -363,7 +728,13 @@
         </w:tc>
         <w:tc>
           <w:tcPr>
-            <w:tcW w:type="dxa" w:w="4320"/>
+            <w:tcW w:type="dxa" w:w="2880"/>
+          </w:tcPr>
+          <w:p/>
+        </w:tc>
+        <w:tc>
+          <w:tcPr>
+            <w:tcW w:type="dxa" w:w="2880"/>
           </w:tcPr>
           <w:p/>
         </w:tc>
@@ -371,11 +742,67 @@
     </w:tbl>
     <w:p/>
     <w:p>
+      <w:r>
+        <w:t>{% for bloco in fluxo_integracao.subsecoes %}</w:t>
+      </w:r>
+    </w:p>
+    <w:p>
+      <w:pPr>
+        <w:pStyle w:val="Heading2"/>
+      </w:pPr>
+      <w:r>
+        <w:t>{{ bloco.titulo }}</w:t>
+      </w:r>
+    </w:p>
+    <w:p>
+      <w:r>
+        <w:t>{% for paragrafo in bloco.paragrafos %}</w:t>
+      </w:r>
+    </w:p>
+    <w:p>
+      <w:r>
+        <w:t>{{ paragrafo }}</w:t>
+      </w:r>
+    </w:p>
+    <w:p>
+      <w:r>
+        <w:t>{% endfor %}</w:t>
+      </w:r>
+    </w:p>
+    <w:p>
+      <w:r>
+        <w:t>{% for item in bloco.bullets %}</w:t>
+      </w:r>
+    </w:p>
+    <w:p>
+      <w:pPr>
+        <w:pStyle w:val="ListBullet"/>
+      </w:pPr>
+      <w:r>
+        <w:t>{{ item }}</w:t>
+      </w:r>
+    </w:p>
+    <w:p>
+      <w:r>
+        <w:t>{% endfor %}</w:t>
+      </w:r>
+    </w:p>
+    <w:p>
+      <w:r>
+        <w:t>{% endfor %}</w:t>
+      </w:r>
+    </w:p>
+    <w:p>
+      <w:r>
+        <w:t>{% endif %}</w:t>
+      </w:r>
+    </w:p>
+    <w:p>
       <w:pPr>
         <w:pStyle w:val="Heading1"/>
       </w:pPr>
       <w:r>
-        <w:t>4. Consequências</w:t>
+        <w:t>5. Consequências</w:t>
       </w:r>
     </w:p>
     <w:p>
@@ -435,7 +862,7 @@
         <w:pStyle w:val="Heading1"/>
       </w:pPr>
       <w:r>
-        <w:t>5. Riscos</w:t>
+        <w:t>6. Riscos</w:t>
       </w:r>
     </w:p>
     <w:tbl>
@@ -457,6 +884,7 @@
           <w:p>
             <w:r>
               <w:rPr>
+                <w:b/>
                 <w:sz w:val="20"/>
               </w:rPr>
               <w:t>Risco</w:t>
@@ -470,6 +898,7 @@
           <w:p>
             <w:r>
               <w:rPr>
+                <w:b/>
                 <w:sz w:val="20"/>
               </w:rPr>
               <w:t>Impacto</w:t>
@@ -483,6 +912,7 @@
           <w:p>
             <w:r>
               <w:rPr>
+                <w:b/>
                 <w:sz w:val="20"/>
               </w:rPr>
               <w:t>Mitigação</w:t>
@@ -498,6 +928,7 @@
           <w:p>
             <w:r>
               <w:rPr>
+                <w:b w:val="0"/>
                 <w:sz w:val="20"/>
               </w:rPr>
               <w:t>{%tr for risco in riscos %}</w:t>
@@ -525,6 +956,7 @@
           <w:p>
             <w:r>
               <w:rPr>
+                <w:b w:val="0"/>
                 <w:sz w:val="20"/>
               </w:rPr>
               <w:t>{{ risco.descricao }}</w:t>
@@ -538,6 +970,7 @@
           <w:p>
             <w:r>
               <w:rPr>
+                <w:b w:val="0"/>
                 <w:sz w:val="20"/>
               </w:rPr>
               <w:t>{{ risco.impacto }}</w:t>
@@ -551,6 +984,7 @@
           <w:p>
             <w:r>
               <w:rPr>
+                <w:b w:val="0"/>
                 <w:sz w:val="20"/>
               </w:rPr>
               <w:t>{{ risco.mitigacao }}</w:t>
@@ -566,6 +1000,7 @@
           <w:p>
             <w:r>
               <w:rPr>
+                <w:b w:val="0"/>
                 <w:sz w:val="20"/>
               </w:rPr>
               <w:t>{%tr endfor %}</w:t>
@@ -592,7 +1027,7 @@
         <w:pStyle w:val="Heading1"/>
       </w:pPr>
       <w:r>
-        <w:t>6. Lacunas Técnicas Abertas</w:t>
+        <w:t>7. Lacunas Técnicas Abertas</w:t>
       </w:r>
     </w:p>
     <w:p>
@@ -618,7 +1053,7 @@
         <w:pStyle w:val="Heading1"/>
       </w:pPr>
       <w:r>
-        <w:t>7. Revisão e Evolução</w:t>
+        <w:t>8. Revisão e Evolução</w:t>
       </w:r>
     </w:p>
     <w:p>

</xml_diff>